<commit_message>
README: link the hosted Vercel demo; ignore .vercel/
Co-Authored-By: Claude Fable 5 <noreply@anthropic.com>
</commit_message>
<xml_diff>
--- a/README.docx
+++ b/README.docx
@@ -17,6 +17,44 @@
         <w:pStyle w:val="FirstParagraph"/>
       </w:pPr>
       <w:r>
+        <w:rPr>
+          <w:b/>
+        </w:rPr>
+        <w:t xml:space="preserve">Live demo:</w:t>
+      </w:r>
+      <w:r>
+        <w:rPr>
+          <w:b/>
+        </w:rPr>
+        <w:t xml:space="preserve"> </w:t>
+      </w:r>
+      <w:hyperlink r:id="rId21">
+        <w:r>
+          <w:rPr>
+            <w:rStyle w:val="Hyperlink"/>
+            <w:b/>
+          </w:rPr>
+          <w:t xml:space="preserve">https://wiki-chatbot-pi.vercel.app</w:t>
+        </w:r>
+      </w:hyperlink>
+      <w:r>
+        <w:t xml:space="preserve"> </w:t>
+      </w:r>
+      <w:r>
+        <w:t xml:space="preserve">— click a sample chip to</w:t>
+      </w:r>
+      <w:r>
+        <w:t xml:space="preserve"> </w:t>
+      </w:r>
+      <w:r>
+        <w:t xml:space="preserve">see each behavior with its full search trace.</w:t>
+      </w:r>
+    </w:p>
+    <w:p>
+      <w:pPr>
+        <w:pStyle w:val="BodyText"/>
+      </w:pPr>
+      <w:r>
         <w:t xml:space="preserve">A question-answering system built on Claude with a</w:t>
       </w:r>
       <w:r>
@@ -227,11 +265,11 @@
       <w:pPr>
         <w:pStyle w:val="Heading2"/>
       </w:pPr>
-      <w:bookmarkStart w:id="21" w:name="setup"/>
+      <w:bookmarkStart w:id="22" w:name="setup"/>
       <w:r>
         <w:t xml:space="preserve">Setup</w:t>
       </w:r>
-      <w:bookmarkEnd w:id="21"/>
+      <w:bookmarkEnd w:id="22"/>
     </w:p>
     <w:p>
       <w:pPr>
@@ -327,11 +365,11 @@
       <w:pPr>
         <w:pStyle w:val="Heading2"/>
       </w:pPr>
-      <w:bookmarkStart w:id="22" w:name="usage"/>
+      <w:bookmarkStart w:id="23" w:name="usage"/>
       <w:r>
         <w:t xml:space="preserve">Usage</w:t>
       </w:r>
-      <w:bookmarkEnd w:id="22"/>
+      <w:bookmarkEnd w:id="23"/>
     </w:p>
     <w:p>
       <w:pPr>
@@ -573,17 +611,49 @@
       <w:pPr>
         <w:pStyle w:val="Heading2"/>
       </w:pPr>
-      <w:bookmarkStart w:id="23" w:name="web-demo-vercel"/>
+      <w:bookmarkStart w:id="24" w:name="web-demo-vercel"/>
       <w:r>
         <w:t xml:space="preserve">Web demo (Vercel)</w:t>
       </w:r>
-      <w:bookmarkEnd w:id="23"/>
+      <w:bookmarkEnd w:id="24"/>
     </w:p>
     <w:p>
       <w:pPr>
         <w:pStyle w:val="FirstParagraph"/>
       </w:pPr>
       <w:r>
+        <w:rPr>
+          <w:b/>
+        </w:rPr>
+        <w:t xml:space="preserve">Hosted at</w:t>
+      </w:r>
+      <w:r>
+        <w:rPr>
+          <w:b/>
+        </w:rPr>
+        <w:t xml:space="preserve"> </w:t>
+      </w:r>
+      <w:hyperlink r:id="rId21">
+        <w:r>
+          <w:rPr>
+            <w:rStyle w:val="Hyperlink"/>
+            <w:b/>
+          </w:rPr>
+          <w:t xml:space="preserve">https://wiki-chatbot-pi.vercel.app</w:t>
+        </w:r>
+      </w:hyperlink>
+      <w:r>
+        <w:rPr>
+          <w:b/>
+        </w:rPr>
+        <w:t xml:space="preserve">.</w:t>
+      </w:r>
+    </w:p>
+    <w:p>
+      <w:pPr>
+        <w:pStyle w:val="BodyText"/>
+      </w:pPr>
+      <w:r>
         <w:t xml:space="preserve">A minimal single-page demo (</w:t>
       </w:r>
       <w:r>
@@ -1036,11 +1106,11 @@
       <w:pPr>
         <w:pStyle w:val="Heading2"/>
       </w:pPr>
-      <w:bookmarkStart w:id="24" w:name="running-the-eval"/>
+      <w:bookmarkStart w:id="25" w:name="running-the-eval"/>
       <w:r>
         <w:t xml:space="preserve">Running the eval</w:t>
       </w:r>
-      <w:bookmarkEnd w:id="24"/>
+      <w:bookmarkEnd w:id="25"/>
     </w:p>
     <w:p>
       <w:pPr>
@@ -1301,7 +1371,7 @@
       <w:pPr>
         <w:pStyle w:val="Heading3"/>
       </w:pPr>
-      <w:bookmarkStart w:id="25" w:name="case-schema-evalcases.jsonl"/>
+      <w:bookmarkStart w:id="26" w:name="case-schema-evalcases.jsonl"/>
       <w:r>
         <w:t xml:space="preserve">Case schema (</w:t>
       </w:r>
@@ -1314,7 +1384,7 @@
       <w:r>
         <w:t xml:space="preserve">)</w:t>
       </w:r>
-      <w:bookmarkEnd w:id="25"/>
+      <w:bookmarkEnd w:id="26"/>
     </w:p>
     <w:tbl>
       <w:tblPr>
@@ -2038,11 +2108,11 @@
       <w:pPr>
         <w:pStyle w:val="Heading3"/>
       </w:pPr>
-      <w:bookmarkStart w:id="26" w:name="metrics-three-dimensions"/>
+      <w:bookmarkStart w:id="27" w:name="metrics-three-dimensions"/>
       <w:r>
         <w:t xml:space="preserve">Metrics (three dimensions)</w:t>
       </w:r>
-      <w:bookmarkEnd w:id="26"/>
+      <w:bookmarkEnd w:id="27"/>
     </w:p>
     <w:p>
       <w:pPr>
@@ -2245,11 +2315,11 @@
       <w:pPr>
         <w:pStyle w:val="Heading3"/>
       </w:pPr>
-      <w:bookmarkStart w:id="27" w:name="models"/>
+      <w:bookmarkStart w:id="28" w:name="models"/>
       <w:r>
         <w:t xml:space="preserve">Models</w:t>
       </w:r>
-      <w:bookmarkEnd w:id="27"/>
+      <w:bookmarkEnd w:id="28"/>
     </w:p>
     <w:p>
       <w:pPr>
@@ -2380,11 +2450,11 @@
       <w:pPr>
         <w:pStyle w:val="Heading3"/>
       </w:pPr>
-      <w:bookmarkStart w:id="28" w:name="judge-versions"/>
+      <w:bookmarkStart w:id="29" w:name="judge-versions"/>
       <w:r>
         <w:t xml:space="preserve">Judge versions</w:t>
       </w:r>
-      <w:bookmarkEnd w:id="28"/>
+      <w:bookmarkEnd w:id="29"/>
     </w:p>
     <w:p>
       <w:pPr>
@@ -2897,11 +2967,11 @@
       <w:pPr>
         <w:pStyle w:val="Heading3"/>
       </w:pPr>
-      <w:bookmarkStart w:id="29" w:name="lexical-metrics-experiment"/>
+      <w:bookmarkStart w:id="30" w:name="lexical-metrics-experiment"/>
       <w:r>
         <w:t xml:space="preserve">Lexical-metrics experiment</w:t>
       </w:r>
-      <w:bookmarkEnd w:id="29"/>
+      <w:bookmarkEnd w:id="30"/>
     </w:p>
     <w:p>
       <w:pPr>
@@ -3029,11 +3099,11 @@
       <w:pPr>
         <w:pStyle w:val="Heading2"/>
       </w:pPr>
-      <w:bookmarkStart w:id="30" w:name="reproduction-notes"/>
+      <w:bookmarkStart w:id="31" w:name="reproduction-notes"/>
       <w:r>
         <w:t xml:space="preserve">Reproduction notes</w:t>
       </w:r>
-      <w:bookmarkEnd w:id="30"/>
+      <w:bookmarkEnd w:id="31"/>
     </w:p>
     <w:p>
       <w:pPr>
@@ -3234,11 +3304,11 @@
       <w:pPr>
         <w:pStyle w:val="Heading2"/>
       </w:pPr>
-      <w:bookmarkStart w:id="31" w:name="repository-layout"/>
+      <w:bookmarkStart w:id="32" w:name="repository-layout"/>
       <w:r>
         <w:t xml:space="preserve">Repository layout</w:t>
       </w:r>
-      <w:bookmarkEnd w:id="31"/>
+      <w:bookmarkEnd w:id="32"/>
     </w:p>
     <w:tbl>
       <w:tblPr>

</xml_diff>